<commit_message>
revisions from Brian's initial comments
</commit_message>
<xml_diff>
--- a/resources/ref.docx
+++ b/resources/ref.docx
@@ -363,6 +363,14 @@
       </w:pPr>
       <w:r>
         <w:t>Mono style</w:t>
+      </w:r>
+    </w:p>
+    <w:p>
+      <w:pPr>
+        <w:pStyle w:val="tablefoot"/>
+      </w:pPr>
+      <w:r>
+        <w:t>Table footer</w:t>
       </w:r>
     </w:p>
     <w:sectPr>
@@ -1799,6 +1807,15 @@
       <w:vanish/>
     </w:rPr>
   </w:style>
+  <w:style w:type="paragraph" w:customStyle="1" w:styleId="tablefoot">
+    <w:name w:val="tablefoot"/>
+    <w:basedOn w:val="mono"/>
+    <w:qFormat/>
+    <w:rsid w:val="00806571"/>
+    <w:rPr>
+      <w:sz w:val="16"/>
+    </w:rPr>
+  </w:style>
 </w:styles>
 </file>
 

</xml_diff>

<commit_message>
add daggers and footnotes to multispecies tables where necessary
</commit_message>
<xml_diff>
--- a/resources/ref.docx
+++ b/resources/ref.docx
@@ -1811,7 +1811,10 @@
     <w:name w:val="tablefoot"/>
     <w:basedOn w:val="mono"/>
     <w:qFormat/>
-    <w:rsid w:val="00806571"/>
+    <w:rsid w:val="00C93D80"/>
+    <w:pPr>
+      <w:spacing w:after="0"/>
+    </w:pPr>
     <w:rPr>
       <w:sz w:val="16"/>
     </w:rPr>

</xml_diff>